<commit_message>
Sync R3 final: v5 title/README rewrite (loss design, not reanalysis target), latest manuscript 4-piece set (Manuscript/Response/Cover; Supplement already current), add M1 real-data MSE-selection scripts (train/eval_mse_select) and plain-MSE rerun scripts (train/eval_mseonly_select)
</commit_message>
<xml_diff>
--- a/manuscript/Response_to_Reviewers_R3_WAF.docx
+++ b/manuscript/Response_to_Reviewers_R3_WAF.docx
@@ -318,22 +318,7 @@
           <w:sz w:val="22"/>
           <w:szCs w:val="22"/>
         </w:rPr>
-        <w:t xml:space="preserve"/>
-      </w:r>
-      <w:r>
-        <w:rPr>
-          <w:b/>
-          <w:sz w:val="22"/>
-          <w:szCs w:val="22"/>
-        </w:rPr>
-        <w:t xml:space="preserve">Our response.</w:t>
-      </w:r>
-      <w:r>
-        <w:rPr>
-          <w:sz w:val="22"/>
-          <w:szCs w:val="22"/>
-        </w:rPr>
-        <w:t xml:space="preserve"> The corrected experiments now include a six-member baseline hierarchy (Section 2c, Tables 3/8/15): quantile mapping (QM), per-grid-point linear regression (OLS), bin-conditional climatology (BinCM), Gaussian/zero-inflated-Gaussian dressing (probabilistic), plus the two DL networks. At 3 h the simple baselines beat both DL networks at every verification reference (ERA5, CHM, GPM); at 24–120 h the DL networks gain positive skill while the monotone baselines (QM) collapse. Probabilistic evaluation (CRPS, Brier, BSS, reliability, sharpness) is in Section 3d. Object-based metrics are in Section 4a (Comment 1c). This hierarchy is the evidence for the paper's central claim that the value of DL post-processing is scale-dependent, not the CNN-versus-one-baseline comparison of the first version.</w:t>
+        <w:t xml:space="preserve">Our response. The corrected experiments now include a six-member baseline hierarchy (Section 2c, Tables 3/8/15): quantile mapping (QM), per-grid-point linear regression (OLS), bin-conditional climatology (BinCM), Gaussian/zero-inflated-Gaussian dressing (probabilistic), plus the two DL networks. At 3 h the simple baselines beat both DL networks at every verification reference (ERA5, CHM, GPM); at 24–120 h the DL networks gain positive skill while the monotone baselines (QM) collapse. Probabilistic evaluation (CRPS, Brier, BSS, reliability, sharpness) is in Section 3d. Object-based metrics are in Section 4a (Comment 1c). This hierarchy is the evidence for the paper's central claim that the value of DL post-processing is scale-dependent, not the CNN-versus-one-baseline comparison of the first version. We did not implement a copula-based multivariate baseline: the six-member hierarchy answers the DL-necessity question at the univariate level, and a copula extension is beyond the scope of this comparison; we note this as a limitation of the baseline set.</w:t>
       </w:r>
     </w:p>
     <w:p>
@@ -541,6 +526,40 @@
       <w:r>
         <w:t>Controlled-experiment attribution (this round). The reviewer questioned the causal attribution of the negative skill to the target signal-to-noise ratio. We agree and now report the decisive control: rerunning the worst-case arm with a pure MSE loss (all other training components unchanged) reduces the degradation at sigma = 1.16 mm/3h from -28.5% to about -0.9% (three-seed mean of -0.5%, -0.9%, and -1.2%; seed 42 -1.2% in Table 4). Across sigma the pure-MSE improvement stays near the mathematical floor of zero (-2.4%, -1.2%, and -0.8% at sigma = 0.5, 1.16, and 2.0 mm/3h, seed 42), whereas the full multi-term loss amplifies it to -3.2%, -28.5%, and -9.5%. Because the injected noise is independent of GFS (r ~ 0), the improvement is approximately -var(pred)/sigma^2, so the magnitude of the negative skill is set by the output variance induced by the training loss, not by the target signal-to-noise ratio per se. The main-text causal statement has been revised accordingly (Sections 1 and 3b), and per-epoch convergence curves for both loss variants are shown in the attached figure (Fig. M1) and in the code repository.</w:t>
       </w:r>
+      <w:r>
+        <w:drawing>
+          <wp:inline xmlns:wp="http://schemas.openxmlformats.org/drawingml/2006/wordprocessingDrawing" xmlns:a="http://schemas.openxmlformats.org/drawingml/2006/main" xmlns:pic="http://schemas.openxmlformats.org/drawingml/2006/picture">
+            <wp:extent cx="4680000" cy="1726092"/>
+            <wp:docPr id="1" name="Picture 1"/>
+            <wp:cNvGraphicFramePr>
+              <a:graphicFrameLocks noChangeAspect="1"/>
+            </wp:cNvGraphicFramePr>
+            <a:graphic>
+              <a:graphicData uri="http://schemas.openxmlformats.org/drawingml/2006/picture">
+                <pic:pic>
+                  <pic:nvPicPr>
+                    <pic:cNvPr id="0" name="image.png"/>
+                    <pic:cNvPicPr/>
+                  </pic:nvPicPr>
+                  <pic:blipFill>
+                    <a:blip r:embed="rId1"/>
+                    <a:stretch>
+                      <a:fillRect/>
+                    </a:stretch>
+                  </pic:blipFill>
+                  <pic:spPr>
+                    <a:xfrm>
+                      <a:off x="0" y="0"/>
+                      <a:ext cx="4680000" cy="1726092"/>
+                    </a:xfrm>
+                    <a:prstGeom prst="rect"/>
+                  </pic:spPr>
+                </pic:pic>
+              </a:graphicData>
+            </a:graphic>
+          </wp:inline>
+        </w:drawing>
+      </w:r>
     </w:p>
     <w:p>
       <w:r>
@@ -548,6 +567,12 @@
       </w:r>
     </w:p>
     <w:p>
+      <w:pPr/>
+      <w:r>
+        <w:t>Fifth, at the accumulated scales the analogous question arises: do the 24–120 h gains also depend on the composite loss? A single-seed 24-h plain-MSE rerun (identical protocol, seed 42) retains and strengthens the gain (+26.9% versus +20.4% for the composite-loss network on the ERA5 reference; QM +2.3%, OLS +6.4%, BinCM +5.6%), so the accumulated-scale skill does not depend on the intensity-weighted loss: the loss amplifies the fine-scale failure but does not manufacture the long-lead gain.</w:t>
+      </w:r>
+    </w:p>
+    <w:p>
       <w:r>
         <w:t>Real-data attribution and the selection confound (M1). We acknowledge that the real-data 3-h negative skill is produced jointly by the multi-term loss and the threshold-skill checkpoint-selection criterion, and that the synthetic experiment separates the loss effect only. Three pieces of evidence are now provided. First, Table S2 lists the three checkpoints actually selected by the composite criterion (S 1.06-1.29; ETS20 0.1712-0.1983; POD20 0.3734-0.3971), together with their validation loss: the selected checkpoints lie within 0.2-2.4% of the global validation-loss minimum, so selection did not sacrifice the loss substantially. Second, Figure S1 shows the per-epoch S and L_val curves for all three seeds. Third, we performed the decisive control requested by the reviewer: an MSE-selected real-data rerun (checkpoints chosen on the validation residual MSE, all other training components identical to the main experiment, three seeds; the original runs archived only composite-score-optimal weights, so a full retrain per seed was required). The test-period 3-h skill on the ERA5 reference remains strongly negative (−15.8%, −43.9%, −74.7%; three-seed mean −44.8%, 95% block-bootstrap CIs excluding zero), differing from the composite-score selection by only +1.3/+2.8/+8.1 pct-pts (−48.0%; Table S3). The selection criterion thus explains at most about 3 pct-pts (worst case about 8 pct-pts) of the −48% effect and is excluded as the dominant source. Fourth, following the reviewer's path A, the real-data protocol of Table S3 has been rerun with the multi-term loss replaced by plain MSE (full retrain, three seeds; Table S4): the test-period 3-h skill changes from −48.0% to +8.1/−11.0/−4.6 (three-seed mean −2.5%; 95% block-bootstrap CIs [+1.8, +12.3], [−18.5, −5.6], [−8.6, −1.8]), removing about 95% of the degradation. The composite loss is therefore the dominant amplifier of the real-task negative skill, in quantitative agreement with the synthetic experiment (Section 3b), while the residual weak-negative mean and the significantly positive seed 42 show that target noise retains a secondary contribution. The manuscript now reports both controls (Section 4d; Tables S3–S4).</w:t>
       </w:r>
@@ -559,7 +584,7 @@
     </w:p>
     <w:p>
       <w:r>
-        <w:t>Attribution wording (M3). The synthetic and real-data settings are now kept distinct: the loss-design magnitude statement is explicitly restricted to the synthetic experiment (Sections 4c and 5, Conclusion 2), the real-data loss-versus-selection decomposition is stated as open (Section 4d), and the introduction's priority claim is replaced by a description of the work actually performed.</w:t>
+        <w:t>Attribution wording (M3). The synthetic and real-data settings are kept distinct in their evidence but agree in their conclusion: the loss-design magnitude statement now covers both settings (the real-task loss-versus-selection decomposition is quantified in Section 4d: selection accounts for at most about 8 pct-pts, and plain MSE removes about 95% of the real-task degradation; Tables S3–S4), and the introduction's priority claim is replaced by a description of the work actually performed.</w:t>
       </w:r>
     </w:p>
     <w:p>
@@ -584,7 +609,7 @@
     </w:p>
     <w:p>
       <w:r>
-        <w:t>Architecture generality (M3). The controlled diagnosis was run with APCNet only; the manuscript now states this plainly in the limitations (Section 4d) and does not claim architecture-independence by construction. Both architectures exhibit the same negative 3-h signature under the same loss and selection criterion (Sections 3c-3e), and at 24-120 h the simpler U-Net consistently outperforms APCNet on all three references (Tables 15-17; e.g. +18.4% vs +14.0% against GPM at 24 h). The discussion now draws the intended conclusion: the 3-h failure is a property of the training configuration (noisy target x multi-term loss x selection), not of one architecture.</w:t>
+        <w:t>Architecture generality (M3). The controlled diagnosis was run with APCNet only; the manuscript now states this plainly in the limitations (Section 4d) and does not claim architecture-independence by construction. Both architectures exhibit the same negative 3-h signature under the same loss and selection criterion (Sections 3c-3e), and at 24–120 h the simpler U-Net consistently outperforms APCNet on all three references (Tables 15-17; e.g. +18.4% vs +14.0% against GPM at 24 h). The discussion now draws the intended conclusion: the 3-h failure is a property of the training configuration (noisy target x multi-term loss x selection), not of one architecture.</w:t>
       </w:r>
     </w:p>
     <w:p>
@@ -594,7 +619,7 @@
     </w:p>
     <w:p>
       <w:r>
-        <w:t>CHM coverage, GPM significance, and 24-120 h intervals (M5-M6). Table 14 is retitled 'Validation-period (in-selection)' and the 12-h vs 24-h coverage mismatch is stated in the caption; the main GPM 3-h verification (n = 2,475) is coverage-assumption-free. The abstract now reports that the 3-h GPM estimates are negative point estimates that do not reach conventional significance (APCNet [-50.5, +13.2]%). For the accumulated scales, block-bootstrap 95% CIs are reported throughout Tables 15-17 (e.g. GPM 24 h APCNet +14.0%, CI [+9.1, +18.7]%; U-Net +18.4%, CI [+15.0, +23.0]%); none of the DL intervals at 24–120 h crosses zero, whereas the grid-point baselines at 72–120 h retain intervals spanning zero (Table 17). The controlled experiment's i.i.d.-Gaussian noise is stated in Section 2d as a lower bound on learnability; spatially correlated real residuals are harder, not easier, which only strengthens the conclusion.</w:t>
+        <w:t>CHM coverage, GPM significance, and 24–120 h intervals (M5-M6). Table 14 is retitled 'Validation-period (in-selection)' and the 12-h vs 24-h coverage mismatch is stated in the caption; the main GPM 3-h verification (n = 2,475) is coverage-assumption-free. The abstract now reports that the 3-h GPM estimates are negative point estimates that do not reach conventional significance (APCNet [-50.5, +13.2]%). For the accumulated scales, block-bootstrap 95% CIs are reported throughout Tables 15-17 (e.g. GPM 24 h APCNet +14.0%, CI [+9.1, +18.7]%; U-Net +18.4%, CI [+15.0, +23.0]%); none of the DL intervals at 24–120 h crosses zero, whereas the grid-point baselines at 72–120 h retain intervals spanning zero (Table 17). The controlled experiment's i.i.d.-Gaussian noise is stated in Section 2d as a lower bound on learnability; spatially correlated real residuals are harder, not easier, which only strengthens the conclusion.</w:t>
       </w:r>
     </w:p>
     <w:p>
@@ -609,7 +634,7 @@
     </w:p>
     <w:p>
       <w:r>
-        <w:t>Minor points (m1-m14). (m1) The 884 CHM-valid grid points (Table 14/16) and the 764 land points (Table 13) are different masks: 764 is the SRTM elevation-valid land subset used for terrain stratification; 884 is the CHM regridded-validity mask (both are now stated in Section 3e). (m2) Table 14 retitled 'Validation-period (in-selection)'. (m3) Table 5 column header corrected to 'Daily-mean rate (mm/12h)'. (m4) Probabilistic scores in Section 4b are labelled as ERA5-reference (Table 11, with occurrence Brier 0.0815/BSS +0.297 and extreme-threshold BSS added to the caption), and the GPM-reference values are in Table 12. (m5) Object-based POD ordering is uniform (network vs GFS) and the loss of the &gt;=20 mm detection gain is stated. (m6) Gate timing as in M7. (m7) Huffman reference updated to V07B (2023). (m8) Table 17 sample counts are 638/636/633 for the 24/72/120-h GPM verification, all starting from 2024-01-01 as stated in Section 2a (00Z-initialized GPM windows with complete IMERG coverage). (m9) The &gt;=20 mm ETS advantage on the ERA5 reference is now stated as statistically significant (Table 10), the &gt;=10 mm one as not. (m10) Equation numbering is sequential (Eq. 1-11) and the forward reference to Eq. (11) is explicit. (m11) Reference list re-sorted (Haynes before Hersbach before Hess; Stovern moved to S-block; Zhang J. 2024 before Zhang X. 2021; Zhao B. 2023 before Zhao T. 2017). (m12) The -46.9% correction narrative is confined to Section 2d; the conclusions now lead with the corrected gate-verified result. (m13) The grid notation '25 x 37' now uses a true multiplication sign, and kg m-2 a superscript two, throughout. (m14) The suggestion to merge Tables 15-17 is appreciated; we keep the three tables separate so that each observation reference (ERA5/CHM/GPM) can be audited independently, and the surrounding text has been condensed: the counted body text is 6,781 words by the journal convention (excluding table rows and captions), within the 7,500-word limit.</w:t>
+        <w:t>Minor points (m1-m14). (m1) The 884 CHM-valid grid points (Table 14/16) and the 764 land points (Table 13) are different masks: 764 is the SRTM elevation-valid land subset used for terrain stratification; 884 is the CHM regridded-validity mask (both are now stated in Section 3e). (m2) Table 14 retitled 'Validation-period (in-selection)'. (m3) Table 5 column header corrected to 'Daily-mean rate (mm/12h)'. (m4) Probabilistic scores in Section 4b are labelled as ERA5-reference (Table 11, with occurrence Brier 0.0815/BSS +0.297 and extreme-threshold BSS added to the caption), and the GPM-reference values are in Table 12. (m5) Object-based POD ordering is uniform (network vs GFS) and the loss of the &gt;=20 mm detection gain is stated. (m6) Gate timing as in M7. (m7) Huffman reference updated to V07B (2023). (m8) Table 17 sample counts are 638/636/633 for the 24/72/120-h GPM verification, all starting from 2024-01-01 as stated in Section 2a (00Z-initialized GPM windows with complete IMERG coverage). (m9) The &gt;=20 mm ETS advantage on the ERA5 reference is now stated as statistically significant (Table 10), the &gt;=10 mm one as not. (m10) Equation numbering is sequential (Eq. 1-11) and the forward reference to Eq. (11) is explicit. (m11) Reference list re-sorted (Haynes before Hersbach before Hess; Stovern moved to S-block; Zhang J. 2024 before Zhang X. 2021; Zhao B. 2023 before Zhao T. 2017). (m12) The -46.9% correction narrative is confined to Section 2d; the conclusions now lead with the corrected gate-verified result. (m13) The grid notation '25 x 37' now uses a true multiplication sign, and kg m-2 a superscript two, throughout. (m14) The suggestion to merge Tables 15-17 is appreciated; we keep the three tables separate so that each observation reference (ERA5/CHM/GPM) can be audited independently, and the surrounding text has been condensed: the counted body text is 7,067 words by the journal convention (excluding table rows and captions), within the 7,500-word limit.</w:t>
       </w:r>
     </w:p>
     <w:p>
@@ -708,6 +733,15 @@
     <w:p>
       <w:pPr>
         <w:spacing w:after="120" w:line="360" w:lineRule="auto"/>
+        <w:ind w:left="360"/>
+      </w:pPr>
+      <w:r>
+        <w:t xml:space="preserve">Regarding the inline comments on the methods (reproducibility). Two points from the inline comments are now explicit in the revised text. First, the early version’s perturbation-based feature-attribution analysis—and any claim about variable importance or gating suppression—has been removed entirely; this paper makes no variable-importance statement. Second, the atrous spatial pyramid pooling (ASPP) and the squeeze-excitation weighting used in the gating are now defined at first use in Section 2b (Eqs. 1–4) with their original references (Chen et al. 2018; Hu et al. 2018; Perez et al. 2018); the earlier informal module name “SE-Hardsigmoid” is replaced by the explicit layer descriptions, while the Hardsigmoid gating nonlinearity itself (Eq. 1) is retained. The normalization statistics are estimated on the training period only (Section 2a).</w:t>
+      </w:r>
+    </w:p>
+    <w:p>
+      <w:pPr>
+        <w:spacing w:after="120" w:line="360" w:lineRule="auto"/>
       </w:pPr>
       <w:r>
         <w:rPr>
@@ -741,7 +775,7 @@
           <w:sz w:val="22"/>
           <w:szCs w:val="22"/>
         </w:rPr>
-        <w:t>(ii) All tables now report month-block bootstrap 95% CIs where the claim is quantitative: ERA5-reference CIs (Table 15), CHM CIs (Table 16, new), GPM CIs (Table 17, new). Observation-scale values: CHM APCNet +5.5% [+3.9,+6.8] (24 h), +5.4% [+3.1,+7.0] (72 h), +4.7% [+2.1,+8.7] (120 h); CHM U-Net +6.9% [+6.2,+8.0], +6.6% [+3.5,+9.4], +7.6% [+4.0,+10.3]; GPM APCNet +14.0% [+9.1,+18.7], +15.5% [+12.1,+17.6], +13.2% [+9.6,+20.2]; GPM U-Net +18.4% [+15.0,+23.0], +16.7% [+14.0,+20.1], +18.0% [+16.4,+20.3]. Every DL improvement at 24-120 h is significant (bootstrap P(improvement&gt;0) = 1.00; 730/728/725 CHM days and 638/636/633 GPM samples).</w:t>
+        <w:t>(ii) All tables now report month-block bootstrap 95% CIs where the claim is quantitative: ERA5-reference CIs (Table 15), CHM CIs (Table 16, new), GPM CIs (Table 17, new). Observation-scale values: CHM APCNet +5.5% [+3.9,+6.8] (24 h), +5.4% [+3.1,+7.0] (72 h), +4.7% [+2.1,+8.7] (120 h); CHM U-Net +6.9% [+6.2,+8.0], +6.6% [+3.5,+9.4], +7.6% [+4.0,+10.3]; GPM APCNet +14.0% [+9.1,+18.7], +15.5% [+12.1,+17.6], +13.2% [+9.6,+20.2]; GPM U-Net +18.4% [+15.0,+23.0], +16.7% [+14.0,+20.1], +18.0% [+16.4,+20.3]. Every DL improvement at 24–120 h is significant (bootstrap P(improvement&gt;0) = 1.00; 730/728/725 CHM days and 638/636/633 GPM samples).</w:t>
       </w:r>
     </w:p>
     <w:p>
@@ -842,4 +876,190 @@
     </w:sectPr>
   </w:body>
 </w:document>
+</file>
+
+<file path=word/styles.xml><?xml version="1.0" encoding="utf-8"?>
+<w:styles xmlns:mc="http://schemas.openxmlformats.org/markup-compatibility/2006" xmlns:r="http://schemas.openxmlformats.org/officeDocument/2006/relationships" xmlns:w14="http://schemas.microsoft.com/office/word/2010/wordml" xmlns:w="http://schemas.openxmlformats.org/wordprocessingml/2006/main" mc:Ignorable="w14">
+  <w:docDefaults>
+    <w:rPrDefault>
+      <w:rPr>
+        <w:rFonts w:asciiTheme="minorHAnsi" w:eastAsiaTheme="minorEastAsia" w:hAnsiTheme="minorHAnsi" w:cstheme="minorBidi"/>
+        <w:sz w:val="24"/>
+        <w:szCs w:val="24"/>
+        <w:lang w:val="en-US" w:eastAsia="en-US" w:bidi="ar-SA"/>
+      </w:rPr>
+    </w:rPrDefault>
+    <w:pPrDefault/>
+  </w:docDefaults>
+  <w:latentStyles w:defLockedState="0" w:defUIPriority="99" w:defSemiHidden="1" w:defUnhideWhenUsed="1" w:defQFormat="0" w:count="276">
+    <w:lsdException w:name="Normal" w:semiHidden="0" w:uiPriority="0" w:unhideWhenUsed="0" w:qFormat="1"/>
+    <w:lsdException w:name="heading 1" w:semiHidden="0" w:uiPriority="9" w:unhideWhenUsed="0" w:qFormat="1"/>
+    <w:lsdException w:name="heading 2" w:uiPriority="9" w:qFormat="1"/>
+    <w:lsdException w:name="heading 3" w:uiPriority="9" w:qFormat="1"/>
+    <w:lsdException w:name="heading 4" w:uiPriority="9" w:qFormat="1"/>
+    <w:lsdException w:name="heading 5" w:uiPriority="9" w:qFormat="1"/>
+    <w:lsdException w:name="heading 6" w:uiPriority="9" w:qFormat="1"/>
+    <w:lsdException w:name="heading 7" w:uiPriority="9" w:qFormat="1"/>
+    <w:lsdException w:name="heading 8" w:uiPriority="9" w:qFormat="1"/>
+    <w:lsdException w:name="heading 9" w:uiPriority="9" w:qFormat="1"/>
+    <w:lsdException w:name="toc 1" w:uiPriority="39"/>
+    <w:lsdException w:name="toc 2" w:uiPriority="39"/>
+    <w:lsdException w:name="toc 3" w:uiPriority="39"/>
+    <w:lsdException w:name="toc 4" w:uiPriority="39"/>
+    <w:lsdException w:name="toc 5" w:uiPriority="39"/>
+    <w:lsdException w:name="toc 6" w:uiPriority="39"/>
+    <w:lsdException w:name="toc 7" w:uiPriority="39"/>
+    <w:lsdException w:name="toc 8" w:uiPriority="39"/>
+    <w:lsdException w:name="toc 9" w:uiPriority="39"/>
+    <w:lsdException w:name="caption" w:uiPriority="35" w:qFormat="1"/>
+    <w:lsdException w:name="Title" w:semiHidden="0" w:uiPriority="10" w:unhideWhenUsed="0" w:qFormat="1"/>
+    <w:lsdException w:name="Default Paragraph Font" w:uiPriority="1"/>
+    <w:lsdException w:name="Subtitle" w:semiHidden="0" w:uiPriority="11" w:unhideWhenUsed="0" w:qFormat="1"/>
+    <w:lsdException w:name="Strong" w:semiHidden="0" w:uiPriority="22" w:unhideWhenUsed="0" w:qFormat="1"/>
+    <w:lsdException w:name="Emphasis" w:semiHidden="0" w:uiPriority="20" w:unhideWhenUsed="0" w:qFormat="1"/>
+    <w:lsdException w:name="Table Grid" w:semiHidden="0" w:uiPriority="59" w:unhideWhenUsed="0"/>
+    <w:lsdException w:name="Placeholder Text" w:unhideWhenUsed="0"/>
+    <w:lsdException w:name="No Spacing" w:semiHidden="0" w:uiPriority="1" w:unhideWhenUsed="0" w:qFormat="1"/>
+    <w:lsdException w:name="Light Shading" w:semiHidden="0" w:uiPriority="60" w:unhideWhenUsed="0"/>
+    <w:lsdException w:name="Light List" w:semiHidden="0" w:uiPriority="61" w:unhideWhenUsed="0"/>
+    <w:lsdException w:name="Light Grid" w:semiHidden="0" w:uiPriority="62" w:unhideWhenUsed="0"/>
+    <w:lsdException w:name="Medium Shading 1" w:semiHidden="0" w:uiPriority="63" w:unhideWhenUsed="0"/>
+    <w:lsdException w:name="Medium Shading 2" w:semiHidden="0" w:uiPriority="64" w:unhideWhenUsed="0"/>
+    <w:lsdException w:name="Medium List 1" w:semiHidden="0" w:uiPriority="65" w:unhideWhenUsed="0"/>
+    <w:lsdException w:name="Medium List 2" w:semiHidden="0" w:uiPriority="66" w:unhideWhenUsed="0"/>
+    <w:lsdException w:name="Medium Grid 1" w:semiHidden="0" w:uiPriority="67" w:unhideWhenUsed="0"/>
+    <w:lsdException w:name="Medium Grid 2" w:semiHidden="0" w:uiPriority="68" w:unhideWhenUsed="0"/>
+    <w:lsdException w:name="Medium Grid 3" w:semiHidden="0" w:uiPriority="69" w:unhideWhenUsed="0"/>
+    <w:lsdException w:name="Dark List" w:semiHidden="0" w:uiPriority="70" w:unhideWhenUsed="0"/>
+    <w:lsdException w:name="Colorful Shading" w:semiHidden="0" w:uiPriority="71" w:unhideWhenUsed="0"/>
+    <w:lsdException w:name="Colorful List" w:semiHidden="0" w:uiPriority="72" w:unhideWhenUsed="0"/>
+    <w:lsdException w:name="Colorful Grid" w:semiHidden="0" w:uiPriority="73" w:unhideWhenUsed="0"/>
+    <w:lsdException w:name="Light Shading Accent 1" w:semiHidden="0" w:uiPriority="60" w:unhideWhenUsed="0"/>
+    <w:lsdException w:name="Light List Accent 1" w:semiHidden="0" w:uiPriority="61" w:unhideWhenUsed="0"/>
+    <w:lsdException w:name="Light Grid Accent 1" w:semiHidden="0" w:uiPriority="62" w:unhideWhenUsed="0"/>
+    <w:lsdException w:name="Medium Shading 1 Accent 1" w:semiHidden="0" w:uiPriority="63" w:unhideWhenUsed="0"/>
+    <w:lsdException w:name="Medium Shading 2 Accent 1" w:semiHidden="0" w:uiPriority="64" w:unhideWhenUsed="0"/>
+    <w:lsdException w:name="Medium List 1 Accent 1" w:semiHidden="0" w:uiPriority="65" w:unhideWhenUsed="0"/>
+    <w:lsdException w:name="Revision" w:unhideWhenUsed="0"/>
+    <w:lsdException w:name="List Paragraph" w:semiHidden="0" w:uiPriority="34" w:unhideWhenUsed="0" w:qFormat="1"/>
+    <w:lsdException w:name="Quote" w:semiHidden="0" w:uiPriority="29" w:unhideWhenUsed="0" w:qFormat="1"/>
+    <w:lsdException w:name="Intense Quote" w:semiHidden="0" w:uiPriority="30" w:unhideWhenUsed="0" w:qFormat="1"/>
+    <w:lsdException w:name="Medium List 2 Accent 1" w:semiHidden="0" w:uiPriority="66" w:unhideWhenUsed="0"/>
+    <w:lsdException w:name="Medium Grid 1 Accent 1" w:semiHidden="0" w:uiPriority="67" w:unhideWhenUsed="0"/>
+    <w:lsdException w:name="Medium Grid 2 Accent 1" w:semiHidden="0" w:uiPriority="68" w:unhideWhenUsed="0"/>
+    <w:lsdException w:name="Medium Grid 3 Accent 1" w:semiHidden="0" w:uiPriority="69" w:unhideWhenUsed="0"/>
+    <w:lsdException w:name="Dark List Accent 1" w:semiHidden="0" w:uiPriority="70" w:unhideWhenUsed="0"/>
+    <w:lsdException w:name="Colorful Shading Accent 1" w:semiHidden="0" w:uiPriority="71" w:unhideWhenUsed="0"/>
+    <w:lsdException w:name="Colorful List Accent 1" w:semiHidden="0" w:uiPriority="72" w:unhideWhenUsed="0"/>
+    <w:lsdException w:name="Colorful Grid Accent 1" w:semiHidden="0" w:uiPriority="73" w:unhideWhenUsed="0"/>
+    <w:lsdException w:name="Light Shading Accent 2" w:semiHidden="0" w:uiPriority="60" w:unhideWhenUsed="0"/>
+    <w:lsdException w:name="Light List Accent 2" w:semiHidden="0" w:uiPriority="61" w:unhideWhenUsed="0"/>
+    <w:lsdException w:name="Light Grid Accent 2" w:semiHidden="0" w:uiPriority="62" w:unhideWhenUsed="0"/>
+    <w:lsdException w:name="Medium Shading 1 Accent 2" w:semiHidden="0" w:uiPriority="63" w:unhideWhenUsed="0"/>
+    <w:lsdException w:name="Medium Shading 2 Accent 2" w:semiHidden="0" w:uiPriority="64" w:unhideWhenUsed="0"/>
+    <w:lsdException w:name="Medium List 1 Accent 2" w:semiHidden="0" w:uiPriority="65" w:unhideWhenUsed="0"/>
+    <w:lsdException w:name="Medium List 2 Accent 2" w:semiHidden="0" w:uiPriority="66" w:unhideWhenUsed="0"/>
+    <w:lsdException w:name="Medium Grid 1 Accent 2" w:semiHidden="0" w:uiPriority="67" w:unhideWhenUsed="0"/>
+    <w:lsdException w:name="Medium Grid 2 Accent 2" w:semiHidden="0" w:uiPriority="68" w:unhideWhenUsed="0"/>
+    <w:lsdException w:name="Medium Grid 3 Accent 2" w:semiHidden="0" w:uiPriority="69" w:unhideWhenUsed="0"/>
+    <w:lsdException w:name="Dark List Accent 2" w:semiHidden="0" w:uiPriority="70" w:unhideWhenUsed="0"/>
+    <w:lsdException w:name="Colorful Shading Accent 2" w:semiHidden="0" w:uiPriority="71" w:unhideWhenUsed="0"/>
+    <w:lsdException w:name="Colorful List Accent 2" w:semiHidden="0" w:uiPriority="72" w:unhideWhenUsed="0"/>
+    <w:lsdException w:name="Colorful Grid Accent 2" w:semiHidden="0" w:uiPriority="73" w:unhideWhenUsed="0"/>
+    <w:lsdException w:name="Light Shading Accent 3" w:semiHidden="0" w:uiPriority="60" w:unhideWhenUsed="0"/>
+    <w:lsdException w:name="Light List Accent 3" w:semiHidden="0" w:uiPriority="61" w:unhideWhenUsed="0"/>
+    <w:lsdException w:name="Light Grid Accent 3" w:semiHidden="0" w:uiPriority="62" w:unhideWhenUsed="0"/>
+    <w:lsdException w:name="Medium Shading 1 Accent 3" w:semiHidden="0" w:uiPriority="63" w:unhideWhenUsed="0"/>
+    <w:lsdException w:name="Medium Shading 2 Accent 3" w:semiHidden="0" w:uiPriority="64" w:unhideWhenUsed="0"/>
+    <w:lsdException w:name="Medium List 1 Accent 3" w:semiHidden="0" w:uiPriority="65" w:unhideWhenUsed="0"/>
+    <w:lsdException w:name="Medium List 2 Accent 3" w:semiHidden="0" w:uiPriority="66" w:unhideWhenUsed="0"/>
+    <w:lsdException w:name="Medium Grid 1 Accent 3" w:semiHidden="0" w:uiPriority="67" w:unhideWhenUsed="0"/>
+    <w:lsdException w:name="Medium Grid 2 Accent 3" w:semiHidden="0" w:uiPriority="68" w:unhideWhenUsed="0"/>
+    <w:lsdException w:name="Medium Grid 3 Accent 3" w:semiHidden="0" w:uiPriority="69" w:unhideWhenUsed="0"/>
+    <w:lsdException w:name="Dark List Accent 3" w:semiHidden="0" w:uiPriority="70" w:unhideWhenUsed="0"/>
+    <w:lsdException w:name="Colorful Shading Accent 3" w:semiHidden="0" w:uiPriority="71" w:unhideWhenUsed="0"/>
+    <w:lsdException w:name="Colorful List Accent 3" w:semiHidden="0" w:uiPriority="72" w:unhideWhenUsed="0"/>
+    <w:lsdException w:name="Colorful Grid Accent 3" w:semiHidden="0" w:uiPriority="73" w:unhideWhenUsed="0"/>
+    <w:lsdException w:name="Light Shading Accent 4" w:semiHidden="0" w:uiPriority="60" w:unhideWhenUsed="0"/>
+    <w:lsdException w:name="Light List Accent 4" w:semiHidden="0" w:uiPriority="61" w:unhideWhenUsed="0"/>
+    <w:lsdException w:name="Light Grid Accent 4" w:semiHidden="0" w:uiPriority="62" w:unhideWhenUsed="0"/>
+    <w:lsdException w:name="Medium Shading 1 Accent 4" w:semiHidden="0" w:uiPriority="63" w:unhideWhenUsed="0"/>
+    <w:lsdException w:name="Medium Shading 2 Accent 4" w:semiHidden="0" w:uiPriority="64" w:unhideWhenUsed="0"/>
+    <w:lsdException w:name="Medium List 1 Accent 4" w:semiHidden="0" w:uiPriority="65" w:unhideWhenUsed="0"/>
+    <w:lsdException w:name="Medium List 2 Accent 4" w:semiHidden="0" w:uiPriority="66" w:unhideWhenUsed="0"/>
+    <w:lsdException w:name="Medium Grid 1 Accent 4" w:semiHidden="0" w:uiPriority="67" w:unhideWhenUsed="0"/>
+    <w:lsdException w:name="Medium Grid 2 Accent 4" w:semiHidden="0" w:uiPriority="68" w:unhideWhenUsed="0"/>
+    <w:lsdException w:name="Medium Grid 3 Accent 4" w:semiHidden="0" w:uiPriority="69" w:unhideWhenUsed="0"/>
+    <w:lsdException w:name="Dark List Accent 4" w:semiHidden="0" w:uiPriority="70" w:unhideWhenUsed="0"/>
+    <w:lsdException w:name="Colorful Shading Accent 4" w:semiHidden="0" w:uiPriority="71" w:unhideWhenUsed="0"/>
+    <w:lsdException w:name="Colorful List Accent 4" w:semiHidden="0" w:uiPriority="72" w:unhideWhenUsed="0"/>
+    <w:lsdException w:name="Colorful Grid Accent 4" w:semiHidden="0" w:uiPriority="73" w:unhideWhenUsed="0"/>
+    <w:lsdException w:name="Light Shading Accent 5" w:semiHidden="0" w:uiPriority="60" w:unhideWhenUsed="0"/>
+    <w:lsdException w:name="Light List Accent 5" w:semiHidden="0" w:uiPriority="61" w:unhideWhenUsed="0"/>
+    <w:lsdException w:name="Light Grid Accent 5" w:semiHidden="0" w:uiPriority="62" w:unhideWhenUsed="0"/>
+    <w:lsdException w:name="Medium Shading 1 Accent 5" w:semiHidden="0" w:uiPriority="63" w:unhideWhenUsed="0"/>
+    <w:lsdException w:name="Medium Shading 2 Accent 5" w:semiHidden="0" w:uiPriority="64" w:unhideWhenUsed="0"/>
+    <w:lsdException w:name="Medium List 1 Accent 5" w:semiHidden="0" w:uiPriority="65" w:unhideWhenUsed="0"/>
+    <w:lsdException w:name="Medium List 2 Accent 5" w:semiHidden="0" w:uiPriority="66" w:unhideWhenUsed="0"/>
+    <w:lsdException w:name="Medium Grid 1 Accent 5" w:semiHidden="0" w:uiPriority="67" w:unhideWhenUsed="0"/>
+    <w:lsdException w:name="Medium Grid 2 Accent 5" w:semiHidden="0" w:uiPriority="68" w:unhideWhenUsed="0"/>
+    <w:lsdException w:name="Medium Grid 3 Accent 5" w:semiHidden="0" w:uiPriority="69" w:unhideWhenUsed="0"/>
+    <w:lsdException w:name="Dark List Accent 5" w:semiHidden="0" w:uiPriority="70" w:unhideWhenUsed="0"/>
+    <w:lsdException w:name="Colorful Shading Accent 5" w:semiHidden="0" w:uiPriority="71" w:unhideWhenUsed="0"/>
+    <w:lsdException w:name="Colorful List Accent 5" w:semiHidden="0" w:uiPriority="72" w:unhideWhenUsed="0"/>
+    <w:lsdException w:name="Colorful Grid Accent 5" w:semiHidden="0" w:uiPriority="73" w:unhideWhenUsed="0"/>
+    <w:lsdException w:name="Light Shading Accent 6" w:semiHidden="0" w:uiPriority="60" w:unhideWhenUsed="0"/>
+    <w:lsdException w:name="Light List Accent 6" w:semiHidden="0" w:uiPriority="61" w:unhideWhenUsed="0"/>
+    <w:lsdException w:name="Light Grid Accent 6" w:semiHidden="0" w:uiPriority="62" w:unhideWhenUsed="0"/>
+    <w:lsdException w:name="Medium Shading 1 Accent 6" w:semiHidden="0" w:uiPriority="63" w:unhideWhenUsed="0"/>
+    <w:lsdException w:name="Medium Shading 2 Accent 6" w:semiHidden="0" w:uiPriority="64" w:unhideWhenUsed="0"/>
+    <w:lsdException w:name="Medium List 1 Accent 6" w:semiHidden="0" w:uiPriority="65" w:unhideWhenUsed="0"/>
+    <w:lsdException w:name="Medium List 2 Accent 6" w:semiHidden="0" w:uiPriority="66" w:unhideWhenUsed="0"/>
+    <w:lsdException w:name="Medium Grid 1 Accent 6" w:semiHidden="0" w:uiPriority="67" w:unhideWhenUsed="0"/>
+    <w:lsdException w:name="Medium Grid 2 Accent 6" w:semiHidden="0" w:uiPriority="68" w:unhideWhenUsed="0"/>
+    <w:lsdException w:name="Medium Grid 3 Accent 6" w:semiHidden="0" w:uiPriority="69" w:unhideWhenUsed="0"/>
+    <w:lsdException w:name="Dark List Accent 6" w:semiHidden="0" w:uiPriority="70" w:unhideWhenUsed="0"/>
+    <w:lsdException w:name="Colorful Shading Accent 6" w:semiHidden="0" w:uiPriority="71" w:unhideWhenUsed="0"/>
+    <w:lsdException w:name="Colorful List Accent 6" w:semiHidden="0" w:uiPriority="72" w:unhideWhenUsed="0"/>
+    <w:lsdException w:name="Colorful Grid Accent 6" w:semiHidden="0" w:uiPriority="73" w:unhideWhenUsed="0"/>
+    <w:lsdException w:name="Subtle Emphasis" w:semiHidden="0" w:uiPriority="19" w:unhideWhenUsed="0" w:qFormat="1"/>
+    <w:lsdException w:name="Intense Emphasis" w:semiHidden="0" w:uiPriority="21" w:unhideWhenUsed="0" w:qFormat="1"/>
+    <w:lsdException w:name="Subtle Reference" w:semiHidden="0" w:uiPriority="31" w:unhideWhenUsed="0" w:qFormat="1"/>
+    <w:lsdException w:name="Intense Reference" w:semiHidden="0" w:uiPriority="32" w:unhideWhenUsed="0" w:qFormat="1"/>
+    <w:lsdException w:name="Book Title" w:semiHidden="0" w:uiPriority="33" w:unhideWhenUsed="0" w:qFormat="1"/>
+    <w:lsdException w:name="Bibliography" w:uiPriority="37"/>
+    <w:lsdException w:name="TOC Heading" w:uiPriority="39" w:qFormat="1"/>
+  </w:latentStyles>
+  <w:style w:type="paragraph" w:default="1" w:styleId="Normal">
+    <w:name w:val="Normal"/>
+    <w:qFormat/>
+  </w:style>
+  <w:style w:type="character" w:default="1" w:styleId="DefaultParagraphFont">
+    <w:name w:val="Default Paragraph Font"/>
+    <w:uiPriority w:val="1"/>
+    <w:semiHidden/>
+    <w:unhideWhenUsed/>
+  </w:style>
+  <w:style w:type="table" w:default="1" w:styleId="TableNormal">
+    <w:name w:val="Normal Table"/>
+    <w:uiPriority w:val="99"/>
+    <w:semiHidden/>
+    <w:unhideWhenUsed/>
+    <w:tblPr>
+      <w:tblInd w:w="0" w:type="dxa"/>
+      <w:tblCellMar>
+        <w:top w:w="0" w:type="dxa"/>
+        <w:left w:w="108" w:type="dxa"/>
+        <w:bottom w:w="0" w:type="dxa"/>
+        <w:right w:w="108" w:type="dxa"/>
+      </w:tblCellMar>
+    </w:tblPr>
+  </w:style>
+  <w:style w:type="numbering" w:default="1" w:styleId="NoList">
+    <w:name w:val="No List"/>
+    <w:uiPriority w:val="99"/>
+    <w:semiHidden/>
+    <w:unhideWhenUsed/>
+  </w:style>
+</w:styles>
 </file>
</xml_diff>